<commit_message>
Polish form demos and fetch form fonts from Google Fonts
</commit_message>
<xml_diff>
--- a/converter/docx/testdata/form-fixed.docx
+++ b/converter/docx/testdata/form-fixed.docx
@@ -12,7 +12,7 @@
           <w:b/>
           <w:sz w:val="32"/>
         </w:rPr>
-        <w:t xml:space="preserve">明書 Certificate</w:t>
+        <w:t xml:space="preserve">明細書 Certificate</w:t>
       </w:r>
     </w:p>
     <w:tbl>
@@ -80,7 +80,7 @@
               <w:rPr>
                 <w:b/>
               </w:rPr>
-              <w:t xml:space="preserve">日</w:t>
+              <w:t xml:space="preserve">Date</w:t>
             </w:r>
           </w:p>
         </w:tc>
@@ -558,14 +558,6 @@
       </w:pPr>
       <w:r>
         <w:t xml:space="preserve">{{missing}}</w:t>
-      </w:r>
-    </w:p>
-    <w:p>
-      <w:pPr>
-        <w:spacing w:before="0" w:after="0"/>
-      </w:pPr>
-      <w:r>
-        <w:t xml:space="preserve">\{{not a tag}}</w:t>
       </w:r>
     </w:p>
     <w:sectPr>

</xml_diff>

<commit_message>
Polish form demos and fetch form fonts from Google Fonts (#92)
</commit_message>
<xml_diff>
--- a/converter/docx/testdata/form-fixed.docx
+++ b/converter/docx/testdata/form-fixed.docx
@@ -12,7 +12,7 @@
           <w:b/>
           <w:sz w:val="32"/>
         </w:rPr>
-        <w:t xml:space="preserve">明書 Certificate</w:t>
+        <w:t xml:space="preserve">明細書 Certificate</w:t>
       </w:r>
     </w:p>
     <w:tbl>
@@ -80,7 +80,7 @@
               <w:rPr>
                 <w:b/>
               </w:rPr>
-              <w:t xml:space="preserve">日</w:t>
+              <w:t xml:space="preserve">Date</w:t>
             </w:r>
           </w:p>
         </w:tc>
@@ -558,14 +558,6 @@
       </w:pPr>
       <w:r>
         <w:t xml:space="preserve">{{missing}}</w:t>
-      </w:r>
-    </w:p>
-    <w:p>
-      <w:pPr>
-        <w:spacing w:before="0" w:after="0"/>
-      </w:pPr>
-      <w:r>
-        <w:t xml:space="preserve">\{{not a tag}}</w:t>
       </w:r>
     </w:p>
     <w:sectPr>

</xml_diff>